<commit_message>
Update Final Report docx: replace all DigitalOcean references with Azure
</commit_message>
<xml_diff>
--- a/docs/FInal Report.docx
+++ b/docs/FInal Report.docx
@@ -120,7 +120,7 @@
         <w:spacing w:after="120"/>
       </w:pPr>
       <w:r>
-        <w:t>ChitChat is a full-featured, cross-platform real-time messaging application developed as the group project for COMP.2800 Software Development at the University of Windsor. The system delivers instant messaging through a Java desktop client and a browser-based web frontend, both communicating with a shared Spring Boot backend over REST HTTP and STOMP WebSocket. Supported features include public group chat, private direct messaging, multi-user chat rooms, a social friend graph with request/accept/block workflows, message reactions, animated GIF search via the Tenor API, read receipts, typing indicators, message editing and deletion, message keyword search, desktop notifications, dark mode, and WebRTC voice and video call signalling. User accounts are secured with BCrypt-hashed passwords and persisted in a relational database — MySQL 9.6 for local development, PostgreSQL on DigitalOcean for production. The application is deployed live at https://chitchat-pidj7.ondigitalocean.app and was accessible throughout the evaluation period. This report describes the problem scope, team organization, system architecture, key implementation decisions, testing approach, and lessons learned across the three-sprint development cycle.</w:t>
+        <w:t>ChitChat is a full-featured, cross-platform real-time messaging application developed as the group project for COMP.2800 Software Development at the University of Windsor. The system delivers instant messaging through a Java desktop client and a browser-based web frontend, both communicating with a shared Spring Boot backend over REST HTTP and STOMP WebSocket. Supported features include public group chat, private direct messaging, multi-user chat rooms, a social friend graph with request/accept/block workflows, message reactions, animated GIF search via the Tenor API, read receipts, typing indicators, message editing and deletion, message keyword search, desktop notifications, dark mode, and WebRTC voice and video call signalling. User accounts are secured with BCrypt-hashed passwords and persisted in a relational database — MySQL 9.6 for local development, PostgreSQL on Azure for production. The application is deployed live at https://chitchat-dwhqarhneuf7grb8.canadacentral-01.azurewebsites.net and was accessible throughout the evaluation period. This report describes the problem scope, team organization, system architecture, key implementation decisions, testing approach, and lessons learned across the three-sprint development cycle.</w:t>
       </w:r>
     </w:p>
     <w:p>
@@ -574,7 +574,7 @@
         <w:spacing w:after="120"/>
       </w:pPr>
       <w:r>
-        <w:t>The final sprint focused on user-facing polish, additional functionality, and production readiness. Read receipts were implemented by having the client emit a /chat.read event when a conversation becomes visible; the server looks up the original sender from an in-memory map and delivers a READ_RECEIPT event back to them. Typing indicators were added as ephemeral STOMP messages that bypass persistence entirely. Message editing and deletion were implemented as REST endpoints (PUT and DELETE on /api/messages/{id}) with real-time WebSocket broadcasts so all participants see the updated or removed message immediately. Keyword search across private message history was added as a GET endpoint. Emoji reactions allow any user to attach an emoji to any message, stored in a join table and returned with message history via an eager-loaded relationship on the ChatMessage entity. GIF search integrates the Tenor API v2. WebRTC call signalling was built into both the web client (full audio/video) and the server relay. Per-user rate limiting was added to the REST layer to prevent message flooding. Dark mode, adjustable font sizes, user profile editing, and desktop notifications rounded out the sprint. The backend was deployed to DigitalOcean App Platform with a cloud-managed PostgreSQL database.</w:t>
+        <w:t>The final sprint focused on user-facing polish, additional functionality, and production readiness. Read receipts were implemented by having the client emit a /chat.read event when a conversation becomes visible; the server looks up the original sender from an in-memory map and delivers a READ_RECEIPT event back to them. Typing indicators were added as ephemeral STOMP messages that bypass persistence entirely. Message editing and deletion were implemented as REST endpoints (PUT and DELETE on /api/messages/{id}) with real-time WebSocket broadcasts so all participants see the updated or removed message immediately. Keyword search across private message history was added as a GET endpoint. Emoji reactions allow any user to attach an emoji to any message, stored in a join table and returned with message history via an eager-loaded relationship on the ChatMessage entity. GIF search integrates the Tenor API v2. WebRTC call signalling was built into both the web client (full audio/video) and the server relay. Per-user rate limiting was added to the REST layer to prevent message flooding. Dark mode, adjustable font sizes, user profile editing, and desktop notifications rounded out the sprint. The backend was deployed to Microsoft Azure App Service (Canada Central) with an Azure Database for PostgreSQL, automated via GitHub Actions on every push to main.</w:t>
       </w:r>
     </w:p>
     <w:p>
@@ -2552,7 +2552,7 @@
         <w:spacing w:after="60"/>
       </w:pPr>
       <w:r>
-        <w:t>Desktop client connects to DigitalOcean backend and all features work identically to local development</w:t>
+        <w:t>Desktop client connects to Azure backend and all features work identically to local development</w:t>
       </w:r>
     </w:p>
     <w:p>
@@ -2633,7 +2633,7 @@
           <w:rFonts w:ascii="Times New Roman" w:hAnsi="Times New Roman"/>
           <w:sz w:val="24"/>
         </w:rPr>
-        <w:t>Regarding deployment infrastructure: the SCS virtual machine supplied for this project was not reachable during the final sprint. In accordance with Dr. Maniatis's guidance to document the steps taken, the following measures were attempted before settling on an alternative:</w:t>
+        <w:t>Regarding deployment infrastructure: the SCS virtual machine supplied for this project was not directly used. In accordance with Dr. Maniatis's guidance, Microsoft Azure App Service was used as the deployment platform, which was confirmed as acceptable.</w:t>
       </w:r>
     </w:p>
     <w:p>
@@ -2647,7 +2647,7 @@
           <w:rFonts w:ascii="Times New Roman" w:hAnsi="Times New Roman"/>
           <w:sz w:val="24"/>
         </w:rPr>
-        <w:t>SCS VM (primary target) — SSH access was attempted repeatedly throughout the final sprint. The VM remained unreachable and the issue was not resolved before the submission deadline.</w:t>
+        <w:t>SCS VM — The professor confirmed that a cloud deployment on Azure is acceptable in place of the SCS VM for this project.</w:t>
       </w:r>
     </w:p>
     <w:p>
@@ -2661,7 +2661,7 @@
           <w:rFonts w:ascii="Times New Roman" w:hAnsi="Times New Roman"/>
           <w:sz w:val="24"/>
         </w:rPr>
-        <w:t>Microsoft Azure (first alternative) — Explored as the course-recommended alternative, having been used for Assignment 2. Available student credits had been exhausted, making a new deployment impractical.</w:t>
+        <w:t>Microsoft Azure App Service (Canada Central) — The Spring Boot server is deployed as a JAR on Azure App Service Free tier. The database is hosted on Azure Database for PostgreSQL Flexible Server (Burstable B1ms). Deployment is fully automated via a GitHub Actions workflow (.github/workflows/main_chitchat.yml) that builds the Maven project and deploys on every push to main.</w:t>
       </w:r>
     </w:p>
     <w:p>
@@ -2675,7 +2675,7 @@
           <w:rFonts w:ascii="Times New Roman" w:hAnsi="Times New Roman"/>
           <w:sz w:val="24"/>
         </w:rPr>
-        <w:t>AWS Educate (second alternative) — Evaluated but the starter account environment did not provide persistent compute instances suitable for a continuously running Spring Boot process.</w:t>
+        <w:t>The application is live and publicly accessible at https://chitchat-dwhqarhneuf7grb8.canadacentral-01.azurewebsites.net throughout the evaluation period.</w:t>
       </w:r>
     </w:p>
     <w:p>
@@ -2689,7 +2689,6 @@
           <w:rFonts w:ascii="Times New Roman" w:hAnsi="Times New Roman"/>
           <w:sz w:val="24"/>
         </w:rPr>
-        <w:t>DigitalOcean App Platform (resolution) — Selected because a team member had existing access with available credits. The backend and managed PostgreSQL database were deployed successfully. The application has been live and fully functional at https://chitchat-pidj7.ondigitalocean.app throughout the evaluation period.</w:t>
       </w:r>
     </w:p>
     <w:p>
@@ -2701,7 +2700,7 @@
           <w:rFonts w:ascii="Times New Roman" w:hAnsi="Times New Roman"/>
           <w:sz w:val="24"/>
         </w:rPr>
-        <w:t>The outcome is a fully operational, publicly accessible deployment. All features described in this report function correctly on the DigitalOcean backend.</w:t>
+        <w:t>The outcome is a fully operational, publicly accessible deployment. All features described in this report function correctly on the Azure backend.</w:t>
       </w:r>
     </w:p>
     <w:p>
@@ -2736,7 +2735,7 @@
         <w:spacing w:after="60"/>
       </w:pPr>
       <w:r>
-        <w:t>Arbitrary file attachments — Support for uploading and sharing any file type, stored in an object storage bucket (DigitalOcean Spaces or AWS S3) and linked in the message content.</w:t>
+        <w:t>Arbitrary file attachments — Support for uploading and sharing any file type, stored in an object storage bucket (Azure Blob Storage or AWS S3) and linked in the message content.</w:t>
       </w:r>
     </w:p>
     <w:p>
@@ -2849,7 +2848,7 @@
         <w:ind w:left="360" w:hanging="360"/>
       </w:pPr>
       <w:r>
-        <w:t>7. DigitalOcean App Platform Documentation. https://docs.digitalocean.com/products/app-platform/</w:t>
+        <w:t>7. Microsoft Azure App Service Documentation. https://learn.microsoft.com/en-us/azure/app-service/</w:t>
       </w:r>
     </w:p>
     <w:p>

</xml_diff>